<commit_message>
Added Automatic Filling Up of GW, Booking Number and Destinatin in LOI Creation
</commit_message>
<xml_diff>
--- a/python/templates/Letter_of_Indemnity.docx
+++ b/python/templates/Letter_of_Indemnity.docx
@@ -44,7 +44,23 @@
           <w:sz w:val="22"/>
           <w:szCs w:val="22"/>
         </w:rPr>
-        <w:t xml:space="preserve"> To : Korea Marine Transport Co., Ltd.</w:t>
+        <w:t xml:space="preserve"> </w:t>
+      </w:r>
+      <w:proofErr w:type="gramStart"/>
+      <w:r>
+        <w:rPr>
+          <w:sz w:val="22"/>
+          <w:szCs w:val="22"/>
+        </w:rPr>
+        <w:t>To :</w:t>
+      </w:r>
+      <w:proofErr w:type="gramEnd"/>
+      <w:r>
+        <w:rPr>
+          <w:sz w:val="22"/>
+          <w:szCs w:val="22"/>
+        </w:rPr>
+        <w:t xml:space="preserve"> Korea Marine Transport Co., Ltd.</w:t>
       </w:r>
     </w:p>
     <w:p>
@@ -96,16 +112,27 @@
         <w:pStyle w:val="Default"/>
         <w:jc w:val="both"/>
         <w:rPr>
-          <w:sz w:val="22"/>
-          <w:szCs w:val="22"/>
-        </w:rPr>
-      </w:pPr>
-      <w:r>
-        <w:rPr>
-          <w:sz w:val="22"/>
-          <w:szCs w:val="22"/>
-        </w:rPr>
-        <w:t xml:space="preserve">Vessel: KMTC OSAKA </w:t>
+          <w:color w:val="auto"/>
+          <w:sz w:val="22"/>
+          <w:szCs w:val="22"/>
+        </w:rPr>
+      </w:pPr>
+      <w:r>
+        <w:rPr>
+          <w:color w:val="auto"/>
+          <w:sz w:val="22"/>
+          <w:szCs w:val="22"/>
+        </w:rPr>
+        <w:t xml:space="preserve">Vessel: </w:t>
+      </w:r>
+      <w:r>
+        <w:rPr>
+          <w:rFonts w:cs="Segoe UI"/>
+          <w:color w:val="auto"/>
+          <w:sz w:val="22"/>
+          <w:szCs w:val="22"/>
+        </w:rPr>
+        <w:t>{{VESSEL_VOYAGE}}</w:t>
       </w:r>
     </w:p>
     <w:p>
@@ -113,12 +140,14 @@
         <w:pStyle w:val="Default"/>
         <w:jc w:val="both"/>
         <w:rPr>
-          <w:sz w:val="22"/>
-          <w:szCs w:val="22"/>
-        </w:rPr>
-      </w:pPr>
-      <w:r>
-        <w:rPr>
+          <w:color w:val="auto"/>
+          <w:sz w:val="22"/>
+          <w:szCs w:val="22"/>
+        </w:rPr>
+      </w:pPr>
+      <w:r>
+        <w:rPr>
+          <w:color w:val="auto"/>
           <w:sz w:val="22"/>
           <w:szCs w:val="22"/>
         </w:rPr>
@@ -130,16 +159,28 @@
         <w:pStyle w:val="Default"/>
         <w:jc w:val="both"/>
         <w:rPr>
-          <w:sz w:val="22"/>
-          <w:szCs w:val="22"/>
-        </w:rPr>
-      </w:pPr>
-      <w:r>
-        <w:rPr>
-          <w:sz w:val="22"/>
-          <w:szCs w:val="22"/>
-        </w:rPr>
-        <w:t xml:space="preserve">Cargo : 1X20 </w:t>
+          <w:color w:val="auto"/>
+          <w:sz w:val="22"/>
+          <w:szCs w:val="22"/>
+        </w:rPr>
+      </w:pPr>
+      <w:proofErr w:type="gramStart"/>
+      <w:r>
+        <w:rPr>
+          <w:color w:val="auto"/>
+          <w:sz w:val="22"/>
+          <w:szCs w:val="22"/>
+        </w:rPr>
+        <w:t>Cargo :</w:t>
+      </w:r>
+      <w:proofErr w:type="gramEnd"/>
+      <w:r>
+        <w:rPr>
+          <w:color w:val="auto"/>
+          <w:sz w:val="22"/>
+          <w:szCs w:val="22"/>
+        </w:rPr>
+        <w:t xml:space="preserve"> 1X20 </w:t>
       </w:r>
     </w:p>
     <w:p>
@@ -147,18 +188,19 @@
         <w:pStyle w:val="Default"/>
         <w:jc w:val="both"/>
         <w:rPr>
-          <w:sz w:val="22"/>
-          <w:szCs w:val="22"/>
-        </w:rPr>
-      </w:pPr>
-    </w:p>
-    <w:p>
-      <w:pPr>
-        <w:pStyle w:val="Default"/>
-        <w:jc w:val="both"/>
+          <w:color w:val="auto"/>
+          <w:sz w:val="22"/>
+          <w:szCs w:val="22"/>
+        </w:rPr>
+      </w:pPr>
+    </w:p>
+    <w:p>
+      <w:pPr>
+        <w:pStyle w:val="Default"/>
         <w:rPr>
           <w:b/>
           <w:bCs/>
+          <w:color w:val="auto"/>
           <w:sz w:val="22"/>
           <w:szCs w:val="22"/>
         </w:rPr>
@@ -167,6 +209,7 @@
         <w:rPr>
           <w:b/>
           <w:bCs/>
+          <w:color w:val="auto"/>
           <w:sz w:val="22"/>
           <w:szCs w:val="22"/>
         </w:rPr>
@@ -176,16 +219,15 @@
     <w:p>
       <w:pPr>
         <w:pStyle w:val="Default"/>
-        <w:jc w:val="both"/>
-        <w:rPr>
-          <w:color w:val="4472C4" w:themeColor="accent1"/>
-          <w:sz w:val="22"/>
-          <w:szCs w:val="22"/>
-        </w:rPr>
-      </w:pPr>
-      <w:r>
-        <w:rPr>
-          <w:color w:val="4472C4" w:themeColor="accent1"/>
+        <w:rPr>
+          <w:color w:val="auto"/>
+          <w:sz w:val="22"/>
+          <w:szCs w:val="22"/>
+        </w:rPr>
+      </w:pPr>
+      <w:r>
+        <w:rPr>
+          <w:color w:val="auto"/>
           <w:sz w:val="22"/>
           <w:szCs w:val="22"/>
         </w:rPr>
@@ -195,10 +237,10 @@
     <w:p>
       <w:pPr>
         <w:pStyle w:val="Default"/>
-        <w:jc w:val="both"/>
         <w:rPr>
           <w:b/>
           <w:bCs/>
+          <w:color w:val="auto"/>
           <w:sz w:val="22"/>
           <w:szCs w:val="22"/>
         </w:rPr>
@@ -207,6 +249,7 @@
         <w:rPr>
           <w:b/>
           <w:bCs/>
+          <w:color w:val="auto"/>
           <w:sz w:val="22"/>
           <w:szCs w:val="22"/>
         </w:rPr>
@@ -216,54 +259,112 @@
     <w:p>
       <w:pPr>
         <w:pStyle w:val="Default"/>
+        <w:rPr>
+          <w:color w:val="auto"/>
+          <w:sz w:val="22"/>
+          <w:szCs w:val="22"/>
+        </w:rPr>
+      </w:pPr>
+      <w:r>
+        <w:rPr>
+          <w:color w:val="auto"/>
+          <w:sz w:val="22"/>
+          <w:szCs w:val="22"/>
+        </w:rPr>
+        <w:t>{{NDG_LIST}}</w:t>
+      </w:r>
+    </w:p>
+    <w:p>
+      <w:pPr>
+        <w:pStyle w:val="Default"/>
         <w:jc w:val="both"/>
         <w:rPr>
-          <w:sz w:val="22"/>
-          <w:szCs w:val="22"/>
-        </w:rPr>
-      </w:pPr>
-      <w:r>
-        <w:rPr>
-          <w:sz w:val="22"/>
-          <w:szCs w:val="22"/>
-        </w:rPr>
-        <w:t>{{NDG_LIST}}</w:t>
-      </w:r>
+          <w:color w:val="auto"/>
+          <w:sz w:val="22"/>
+          <w:szCs w:val="22"/>
+        </w:rPr>
+      </w:pPr>
     </w:p>
     <w:p>
       <w:pPr>
         <w:pStyle w:val="Default"/>
         <w:jc w:val="both"/>
         <w:rPr>
-          <w:sz w:val="22"/>
-          <w:szCs w:val="22"/>
-        </w:rPr>
-      </w:pPr>
+          <w:color w:val="auto"/>
+          <w:sz w:val="22"/>
+          <w:szCs w:val="22"/>
+        </w:rPr>
+      </w:pPr>
+      <w:proofErr w:type="gramStart"/>
+      <w:r>
+        <w:rPr>
+          <w:color w:val="auto"/>
+          <w:sz w:val="22"/>
+          <w:szCs w:val="22"/>
+        </w:rPr>
+        <w:t>Weight :</w:t>
+      </w:r>
+      <w:proofErr w:type="gramEnd"/>
+      <w:r>
+        <w:rPr>
+          <w:color w:val="auto"/>
+          <w:sz w:val="22"/>
+          <w:szCs w:val="22"/>
+        </w:rPr>
+        <w:t xml:space="preserve"> GW: </w:t>
+      </w:r>
+      <w:r>
+        <w:rPr>
+          <w:color w:val="auto"/>
+          <w:sz w:val="22"/>
+          <w:szCs w:val="22"/>
+        </w:rPr>
+        <w:t>{{TOTAL_GW}}</w:t>
+      </w:r>
     </w:p>
     <w:p>
       <w:pPr>
         <w:pStyle w:val="Default"/>
         <w:jc w:val="both"/>
         <w:rPr>
-          <w:color w:val="4472C4" w:themeColor="accent1"/>
-          <w:sz w:val="22"/>
-          <w:szCs w:val="22"/>
-        </w:rPr>
-      </w:pPr>
-      <w:r>
-        <w:rPr>
-          <w:sz w:val="22"/>
-          <w:szCs w:val="22"/>
-        </w:rPr>
-        <w:t xml:space="preserve">Weight : GW: </w:t>
-      </w:r>
-      <w:r>
-        <w:rPr>
-          <w:color w:val="4472C4" w:themeColor="accent1"/>
-          <w:sz w:val="22"/>
-          <w:szCs w:val="22"/>
-        </w:rPr>
-        <w:t>{{TOTAL_GW}}</w:t>
+          <w:color w:val="auto"/>
+          <w:sz w:val="22"/>
+          <w:szCs w:val="22"/>
+        </w:rPr>
+      </w:pPr>
+      <w:r>
+        <w:rPr>
+          <w:color w:val="auto"/>
+          <w:sz w:val="22"/>
+          <w:szCs w:val="22"/>
+        </w:rPr>
+        <w:t xml:space="preserve">Bill(s) of </w:t>
+      </w:r>
+      <w:proofErr w:type="gramStart"/>
+      <w:r>
+        <w:rPr>
+          <w:color w:val="auto"/>
+          <w:sz w:val="22"/>
+          <w:szCs w:val="22"/>
+        </w:rPr>
+        <w:t>Lading :</w:t>
+      </w:r>
+      <w:proofErr w:type="gramEnd"/>
+      <w:r>
+        <w:rPr>
+          <w:color w:val="auto"/>
+          <w:sz w:val="22"/>
+          <w:szCs w:val="22"/>
+        </w:rPr>
+        <w:t xml:space="preserve"> </w:t>
+      </w:r>
+      <w:r>
+        <w:rPr>
+          <w:color w:val="auto"/>
+          <w:sz w:val="22"/>
+          <w:szCs w:val="22"/>
+        </w:rPr>
+        <w:t>{{BOOKING_NUMBER}}</w:t>
       </w:r>
     </w:p>
     <w:p>
@@ -271,24 +372,36 @@
         <w:pStyle w:val="Default"/>
         <w:jc w:val="both"/>
         <w:rPr>
-          <w:sz w:val="22"/>
-          <w:szCs w:val="22"/>
-        </w:rPr>
-      </w:pPr>
-      <w:r>
-        <w:rPr>
-          <w:sz w:val="22"/>
-          <w:szCs w:val="22"/>
-        </w:rPr>
-        <w:t xml:space="preserve">Bill(s) of Lading : </w:t>
-      </w:r>
-      <w:r>
-        <w:rPr>
-          <w:color w:val="4472C4" w:themeColor="accent1"/>
-          <w:sz w:val="22"/>
-          <w:szCs w:val="22"/>
-        </w:rPr>
-        <w:t>PH00142564</w:t>
+          <w:color w:val="auto"/>
+          <w:sz w:val="22"/>
+          <w:szCs w:val="22"/>
+        </w:rPr>
+      </w:pPr>
+      <w:r>
+        <w:rPr>
+          <w:color w:val="auto"/>
+          <w:sz w:val="22"/>
+          <w:szCs w:val="22"/>
+        </w:rPr>
+        <w:t xml:space="preserve">Carriage </w:t>
+      </w:r>
+      <w:proofErr w:type="gramStart"/>
+      <w:r>
+        <w:rPr>
+          <w:color w:val="auto"/>
+          <w:sz w:val="22"/>
+          <w:szCs w:val="22"/>
+        </w:rPr>
+        <w:t>From :</w:t>
+      </w:r>
+      <w:proofErr w:type="gramEnd"/>
+      <w:r>
+        <w:rPr>
+          <w:color w:val="auto"/>
+          <w:sz w:val="22"/>
+          <w:szCs w:val="22"/>
+        </w:rPr>
+        <w:t xml:space="preserve"> MICP </w:t>
       </w:r>
     </w:p>
     <w:p>
@@ -296,17 +409,11 @@
         <w:pStyle w:val="Default"/>
         <w:jc w:val="both"/>
         <w:rPr>
-          <w:sz w:val="22"/>
-          <w:szCs w:val="22"/>
-        </w:rPr>
-      </w:pPr>
-      <w:r>
-        <w:rPr>
-          <w:sz w:val="22"/>
-          <w:szCs w:val="22"/>
-        </w:rPr>
-        <w:t xml:space="preserve">Carriage From : MICP </w:t>
-      </w:r>
+          <w:color w:val="auto"/>
+          <w:sz w:val="22"/>
+          <w:szCs w:val="22"/>
+        </w:rPr>
+      </w:pPr>
     </w:p>
     <w:p>
       <w:pPr>
@@ -317,6 +424,55 @@
           <w:szCs w:val="22"/>
         </w:rPr>
       </w:pPr>
+      <w:r>
+        <w:rPr>
+          <w:color w:val="auto"/>
+          <w:sz w:val="22"/>
+          <w:szCs w:val="22"/>
+        </w:rPr>
+        <w:t xml:space="preserve">We, PIONEER ADHESIVES </w:t>
+      </w:r>
+      <w:proofErr w:type="gramStart"/>
+      <w:r>
+        <w:rPr>
+          <w:color w:val="auto"/>
+          <w:sz w:val="22"/>
+          <w:szCs w:val="22"/>
+        </w:rPr>
+        <w:t>INC .the</w:t>
+      </w:r>
+      <w:proofErr w:type="gramEnd"/>
+      <w:r>
+        <w:rPr>
+          <w:color w:val="auto"/>
+          <w:sz w:val="22"/>
+          <w:szCs w:val="22"/>
+        </w:rPr>
+        <w:t xml:space="preserve"> shippers, have requested you to carry the above-mentioned non-dangerous goods in one container from / to MANILA to </w:t>
+      </w:r>
+      <w:r>
+        <w:rPr>
+          <w:color w:val="auto"/>
+          <w:sz w:val="22"/>
+          <w:szCs w:val="22"/>
+        </w:rPr>
+        <w:t>{{DESTINATION}}</w:t>
+      </w:r>
+      <w:r>
+        <w:rPr>
+          <w:color w:val="auto"/>
+          <w:sz w:val="22"/>
+          <w:szCs w:val="22"/>
+        </w:rPr>
+        <w:t>, In consideration of your complying with our aforesaid request, we hereby agree as follows</w:t>
+      </w:r>
+      <w:r>
+        <w:rPr>
+          <w:sz w:val="22"/>
+          <w:szCs w:val="22"/>
+        </w:rPr>
+        <w:t xml:space="preserve">: </w:t>
+      </w:r>
     </w:p>
     <w:p>
       <w:pPr>
@@ -332,53 +488,35 @@
           <w:sz w:val="22"/>
           <w:szCs w:val="22"/>
         </w:rPr>
-        <w:t xml:space="preserve">We, </w:t>
-      </w:r>
-      <w:r>
-        <w:rPr>
-          <w:color w:val="FF0000"/>
-          <w:sz w:val="22"/>
-          <w:szCs w:val="22"/>
-        </w:rPr>
-        <w:t>PIONEER ADHESIVES INC .</w:t>
-      </w:r>
-      <w:r>
-        <w:rPr>
-          <w:sz w:val="22"/>
-          <w:szCs w:val="22"/>
-        </w:rPr>
-        <w:t xml:space="preserve">the shippers, have requested you to carry the above-mentioned non-dangerous goods in one container from / to </w:t>
-      </w:r>
-      <w:r>
-        <w:rPr>
-          <w:color w:val="FF0000"/>
-          <w:sz w:val="22"/>
-          <w:szCs w:val="22"/>
-        </w:rPr>
-        <w:t xml:space="preserve">MANILA to </w:t>
-      </w:r>
-      <w:r>
-        <w:rPr>
-          <w:color w:val="4472C4" w:themeColor="accent1"/>
-          <w:sz w:val="22"/>
-          <w:szCs w:val="22"/>
-        </w:rPr>
-        <w:t>JAKARTA INDONESIA</w:t>
-      </w:r>
-      <w:r>
-        <w:rPr>
-          <w:color w:val="FF0000"/>
-          <w:sz w:val="22"/>
-          <w:szCs w:val="22"/>
-        </w:rPr>
-        <w:t xml:space="preserve">, </w:t>
-      </w:r>
-      <w:r>
-        <w:rPr>
-          <w:sz w:val="22"/>
-          <w:szCs w:val="22"/>
-        </w:rPr>
-        <w:t xml:space="preserve">In consideration of your complying with our aforesaid request, we hereby agree as follows: </w:t>
+        <w:t>1.To indemnify you, your servants and agents and to hold all of you harmless in respect of</w:t>
+      </w:r>
+      <w:r>
+        <w:rPr>
+          <w:sz w:val="22"/>
+          <w:szCs w:val="22"/>
+        </w:rPr>
+        <w:t xml:space="preserve"> </w:t>
+      </w:r>
+      <w:r>
+        <w:rPr>
+          <w:sz w:val="22"/>
+          <w:szCs w:val="22"/>
+        </w:rPr>
+        <w:t>any liability, loss, damage or expense of whatsoever nature and how so ever arising</w:t>
+      </w:r>
+      <w:r>
+        <w:rPr>
+          <w:sz w:val="22"/>
+          <w:szCs w:val="22"/>
+        </w:rPr>
+        <w:t xml:space="preserve"> </w:t>
+      </w:r>
+      <w:r>
+        <w:rPr>
+          <w:sz w:val="22"/>
+          <w:szCs w:val="22"/>
+        </w:rPr>
+        <w:t>which you may sustain by reason of the goods being carried.</w:t>
       </w:r>
     </w:p>
     <w:p>
@@ -390,12 +528,22 @@
           <w:szCs w:val="22"/>
         </w:rPr>
       </w:pPr>
-      <w:r>
-        <w:rPr>
-          <w:sz w:val="22"/>
-          <w:szCs w:val="22"/>
-        </w:rPr>
-        <w:t>1.To indemnify you, your servants and agents and to hold all of you harmless in respect of</w:t>
+    </w:p>
+    <w:p>
+      <w:pPr>
+        <w:pStyle w:val="Default"/>
+        <w:jc w:val="both"/>
+        <w:rPr>
+          <w:sz w:val="22"/>
+          <w:szCs w:val="22"/>
+        </w:rPr>
+      </w:pPr>
+      <w:r>
+        <w:rPr>
+          <w:sz w:val="22"/>
+          <w:szCs w:val="22"/>
+        </w:rPr>
+        <w:t>2.In the event of any proceedings being commenced against you or any of your servants or</w:t>
       </w:r>
       <w:r>
         <w:rPr>
@@ -409,62 +557,23 @@
           <w:sz w:val="22"/>
           <w:szCs w:val="22"/>
         </w:rPr>
-        <w:t>any liability, loss, damage or expense of whatsoever nature and how so ever arising</w:t>
-      </w:r>
-      <w:r>
-        <w:rPr>
-          <w:sz w:val="22"/>
-          <w:szCs w:val="22"/>
-        </w:rPr>
-        <w:t xml:space="preserve"> </w:t>
-      </w:r>
-      <w:r>
-        <w:rPr>
-          <w:sz w:val="22"/>
-          <w:szCs w:val="22"/>
-        </w:rPr>
-        <w:t>which you may sustain by reason of the goods being carried.</w:t>
-      </w:r>
-    </w:p>
-    <w:p>
-      <w:pPr>
-        <w:pStyle w:val="Default"/>
-        <w:jc w:val="both"/>
-        <w:rPr>
-          <w:sz w:val="22"/>
-          <w:szCs w:val="22"/>
-        </w:rPr>
-      </w:pPr>
-    </w:p>
-    <w:p>
-      <w:pPr>
-        <w:pStyle w:val="Default"/>
-        <w:jc w:val="both"/>
-        <w:rPr>
-          <w:sz w:val="22"/>
-          <w:szCs w:val="22"/>
-        </w:rPr>
-      </w:pPr>
-      <w:r>
-        <w:rPr>
-          <w:sz w:val="22"/>
-          <w:szCs w:val="22"/>
-        </w:rPr>
-        <w:t>2.In the event of any proceedings being commenced against you or any of your servants or</w:t>
-      </w:r>
-      <w:r>
-        <w:rPr>
-          <w:sz w:val="22"/>
-          <w:szCs w:val="22"/>
-        </w:rPr>
-        <w:t xml:space="preserve"> </w:t>
-      </w:r>
-      <w:r>
-        <w:rPr>
-          <w:sz w:val="22"/>
-          <w:szCs w:val="22"/>
-        </w:rPr>
-        <w:t>agents in connection with the carriage of the goods a aforesaid, to provide you or them on</w:t>
+        <w:t xml:space="preserve">agents in connection with the carriage of the goods </w:t>
+      </w:r>
+      <w:proofErr w:type="gramStart"/>
+      <w:r>
+        <w:rPr>
+          <w:sz w:val="22"/>
+          <w:szCs w:val="22"/>
+        </w:rPr>
+        <w:t>a</w:t>
+      </w:r>
+      <w:proofErr w:type="gramEnd"/>
+      <w:r>
+        <w:rPr>
+          <w:sz w:val="22"/>
+          <w:szCs w:val="22"/>
+        </w:rPr>
+        <w:t xml:space="preserve"> aforesaid, to provide you or them on</w:t>
       </w:r>
       <w:r>
         <w:rPr>

</xml_diff>